<commit_message>
Reflect on training camp learning
</commit_message>
<xml_diff>
--- a/artifacts/lesson8-homework-report.docx
+++ b/artifacts/lesson8-homework-report.docx
@@ -4310,7 +4310,56 @@
           <w:color w:val="20262E"/>
           <w:sz w:val="21"/>
         </w:rPr>
-        <w:t>结果驱动下一步：若采集很快但 7 天引用率低，优先改搜索与引用体验；若来源漏填多，优先做快捷来源和补录；若重复提醒频繁触发，再调整去重规则；若功能一周内很少触发，就先检查默认键位和目标场景，而不是继续增加 AI 能力。## 7. 资料与文件</w:t>
+        <w:t>结果驱动下一步：若采集很快但 7 天引用率低，优先改搜索与引用体验；若来源漏填多，优先做快捷来源和补录；若重复提醒频繁触发，再调整去重规则；若功能一周内很少触发，就先检查默认键位和目标场景，而不是继续增加 AI 能力。</w:t>
+      </w:r>
+    </w:p>
+    <w:p>
+      <w:pPr>
+        <w:pStyle w:val="Heading2"/>
+      </w:pPr>
+      <w:r>
+        <w:t>66 整个训练营，我真正学到了什么</w:t>
+      </w:r>
+    </w:p>
+    <w:p>
+      <w:r>
+        <w:rPr>
+          <w:rFonts w:ascii="Microsoft YaHei" w:hAnsi="Microsoft YaHei" w:eastAsia="Microsoft YaHei"/>
+          <w:b w:val="0"/>
+          <w:color w:val="20262E"/>
+          <w:sz w:val="21"/>
+        </w:rPr>
+        <w:t>回看前八课，我真正学到的不是多会了几个工具，而是如何把一个 AI 硬件想法变成可检查、可复现的用户体验。起初我容易把方案写得很完整，却把“程序跑了”“设备连上了”“用户按键后任务完成了”混成一个结论。EasyInput 的开发与联调让我学会分层看证据：源码说明设计，构建说明产物，设备回执说明配置被接收，实体按键后的界面和数据变化才说明实际路径走通。每一层能证明什么、不能证明什么，都要说清楚。</w:t>
+      </w:r>
+    </w:p>
+    <w:p>
+      <w:r>
+        <w:rPr>
+          <w:rFonts w:ascii="Microsoft YaHei" w:hAnsi="Microsoft YaHei" w:eastAsia="Microsoft YaHei"/>
+          <w:b w:val="0"/>
+          <w:color w:val="20262E"/>
+          <w:sz w:val="21"/>
+        </w:rPr>
+        <w:t>我也学会了给硬件和人分配不同职责。八个键很有限，价值不在堆动作，而在找到高频任务里最碍事的一步。第四课把创作动作接到实体键，第八课又让我看到创作前的素材入口仍有断点，所以把 KEY4 用于跨应用采集。按键缩短进入任务的路径；预览、修改、填写来源和决定是否入库交给人。速度与控制感需要一起设计，尤其是处理可能误复制的内容时。</w:t>
+      </w:r>
+    </w:p>
+    <w:p>
+      <w:r>
+        <w:rPr>
+          <w:rFonts w:ascii="Microsoft YaHei" w:hAnsi="Microsoft YaHei" w:eastAsia="Microsoft YaHei"/>
+          <w:b w:val="0"/>
+          <w:color w:val="20262E"/>
+          <w:sz w:val="21"/>
+        </w:rPr>
+        <w:t>作为产品经理，我现在会先描述用户要完成的任务，再决定做什么功能；把能观察到的测试结果和仍待验证的价值假设分开。一次联调成功并不能证明长期效率提升。接下来最值得做的，是观察一周真实采集能否被找回和引用，记录取消、漏填来源和重复素材发生在哪里，再据此迭代。能用真实使用修正自己的判断，是这次训练营留给我最重要的能力。</w:t>
+      </w:r>
+    </w:p>
+    <w:p>
+      <w:pPr>
+        <w:pStyle w:val="Heading1"/>
+      </w:pPr>
+      <w:r>
+        <w:t>7 资料与文件</w:t>
       </w:r>
     </w:p>
     <w:p>

</xml_diff>